<commit_message>
docs: credit Gary Hawley on the guides; regenerate Word docs; drop PDF
- Add "Developed by Gary Hawley — gary.hawley@gmail.com" byline to USER_GUIDE.md
  and ADMIN_GUIDE.md.
- Regenerate USER_GUIDE.docx and add ADMIN_GUIDE.docx, with the author embedded
  in the Word document metadata (dc:creator).
- Remove USER_GUIDE.pdf (Word-only deliverables now).

Regenerate with:
  pandoc USER_GUIDE.md  -f gfm -o USER_GUIDE.docx  --metadata title="printcap — End-User Guide"      --metadata author="Gary Hawley <gary.hawley@gmail.com>"
  pandoc ADMIN_GUIDE.md -f gfm -o ADMIN_GUIDE.docx --metadata title="printcap — Administrator Guide" --metadata author="Gary Hawley <gary.hawley@gmail.com>"

Co-Authored-By: Claude Opus 4.8 (1M context) <noreply@anthropic.com>
</commit_message>
<xml_diff>
--- a/USER_GUIDE.docx
+++ b/USER_GUIDE.docx
@@ -10,7 +10,15 @@
         <w:t xml:space="preserve">printcap — End-User Guide</w:t>
       </w:r>
     </w:p>
-    <w:bookmarkStart w:id="51" w:name="printcap--end-user-guide"/>
+    <w:p>
+      <w:pPr>
+        <w:pStyle w:val="Author"/>
+      </w:pPr>
+      <w:r>
+        <w:t xml:space="preserve">Gary Hawley &lt;gary.hawley@gmail.com&gt;</w:t>
+      </w:r>
+    </w:p>
+    <w:bookmarkStart w:id="52" w:name="printcap--end-user-guide"/>
     <w:p>
       <w:pPr>
         <w:pStyle w:val="Heading1"/>
@@ -22,6 +30,35 @@
     <w:p>
       <w:pPr>
         <w:pStyle w:val="FirstParagraph"/>
+      </w:pPr>
+      <w:r>
+        <w:rPr>
+          <w:i/>
+          <w:iCs/>
+        </w:rPr>
+        <w:t xml:space="preserve">Developed by Gary Hawley —</w:t>
+      </w:r>
+      <w:r>
+        <w:rPr>
+          <w:i/>
+          <w:iCs/>
+        </w:rPr>
+        <w:t xml:space="preserve"> </w:t>
+      </w:r>
+      <w:hyperlink r:id="rId9">
+        <w:r>
+          <w:rPr>
+            <w:rStyle w:val="Hyperlink"/>
+            <w:i/>
+            <w:iCs/>
+          </w:rPr>
+          <w:t xml:space="preserve">gary.hawley@gmail.com</w:t>
+        </w:r>
+      </w:hyperlink>
+    </w:p>
+    <w:p>
+      <w:pPr>
+        <w:pStyle w:val="BodyText"/>
       </w:pPr>
       <w:r>
         <w:t xml:space="preserve">A friendly, step-by-step guide to using</w:t>
@@ -141,7 +178,7 @@
         </w:pict>
       </w:r>
     </w:p>
-    <w:bookmarkStart w:id="9" w:name="contents"/>
+    <w:bookmarkStart w:id="10" w:name="contents"/>
     <w:p>
       <w:pPr>
         <w:pStyle w:val="Heading2"/>
@@ -412,8 +449,8 @@
         </w:pict>
       </w:r>
     </w:p>
-    <w:bookmarkEnd w:id="9"/>
-    <w:bookmarkStart w:id="10" w:name="X8ed5510d83923f3802689a7de148df4d449e6c6"/>
+    <w:bookmarkEnd w:id="10"/>
+    <w:bookmarkStart w:id="11" w:name="X8ed5510d83923f3802689a7de148df4d449e6c6"/>
     <w:p>
       <w:pPr>
         <w:pStyle w:val="Heading2"/>
@@ -771,8 +808,8 @@
         </w:pict>
       </w:r>
     </w:p>
-    <w:bookmarkEnd w:id="10"/>
-    <w:bookmarkStart w:id="11" w:name="Xa023a275a1f8726eae31344a75046d340aa2398"/>
+    <w:bookmarkEnd w:id="11"/>
+    <w:bookmarkStart w:id="12" w:name="Xa023a275a1f8726eae31344a75046d340aa2398"/>
     <w:p>
       <w:pPr>
         <w:pStyle w:val="Heading2"/>
@@ -1064,8 +1101,8 @@
         </w:pict>
       </w:r>
     </w:p>
-    <w:bookmarkEnd w:id="11"/>
-    <w:bookmarkStart w:id="12" w:name="X21cf54cc230e2a0e7c3e73fa8df0f61e67a9133"/>
+    <w:bookmarkEnd w:id="12"/>
+    <w:bookmarkStart w:id="13" w:name="X21cf54cc230e2a0e7c3e73fa8df0f61e67a9133"/>
     <w:p>
       <w:pPr>
         <w:pStyle w:val="Heading2"/>
@@ -1255,8 +1292,8 @@
         </w:pict>
       </w:r>
     </w:p>
-    <w:bookmarkEnd w:id="12"/>
-    <w:bookmarkStart w:id="13" w:name="X91d6c25e8bf9a9e871f16dd8b5fbdee512cd769"/>
+    <w:bookmarkEnd w:id="13"/>
+    <w:bookmarkStart w:id="14" w:name="X91d6c25e8bf9a9e871f16dd8b5fbdee512cd769"/>
     <w:p>
       <w:pPr>
         <w:pStyle w:val="Heading2"/>
@@ -1627,8 +1664,8 @@
         </w:pict>
       </w:r>
     </w:p>
-    <w:bookmarkEnd w:id="13"/>
-    <w:bookmarkStart w:id="18" w:name="Xca09cd8045eab332c88910afe49948f84016eab"/>
+    <w:bookmarkEnd w:id="14"/>
+    <w:bookmarkStart w:id="19" w:name="Xca09cd8045eab332c88910afe49948f84016eab"/>
     <w:p>
       <w:pPr>
         <w:pStyle w:val="Heading2"/>
@@ -1637,7 +1674,7 @@
         <w:t xml:space="preserve">5. Capturing print jobs (the core feature)</w:t>
       </w:r>
     </w:p>
-    <w:bookmarkStart w:id="14" w:name="X2a91c4fa8544256a75050a7351d96efa4c13849"/>
+    <w:bookmarkStart w:id="15" w:name="X2a91c4fa8544256a75050a7351d96efa4c13849"/>
     <w:p>
       <w:pPr>
         <w:pStyle w:val="Heading3"/>
@@ -1889,8 +1926,8 @@
         <w:t xml:space="preserve">TLS certificate, per-queue mainframe settings, etc.).</w:t>
       </w:r>
     </w:p>
-    <w:bookmarkEnd w:id="14"/>
-    <w:bookmarkStart w:id="15" w:name="Xb2f9fd51ba2937a1a19f8deb876de58c35f7837"/>
+    <w:bookmarkEnd w:id="15"/>
+    <w:bookmarkStart w:id="16" w:name="Xb2f9fd51ba2937a1a19f8deb876de58c35f7837"/>
     <w:p>
       <w:pPr>
         <w:pStyle w:val="Heading3"/>
@@ -2114,8 +2151,8 @@
         <w:t xml:space="preserve">(0 = no limit).</w:t>
       </w:r>
     </w:p>
-    <w:bookmarkEnd w:id="15"/>
-    <w:bookmarkStart w:id="16" w:name="X61e966a42d82f6ed03f33666efd710e5f018b72"/>
+    <w:bookmarkEnd w:id="16"/>
+    <w:bookmarkStart w:id="17" w:name="X61e966a42d82f6ed03f33666efd710e5f018b72"/>
     <w:p>
       <w:pPr>
         <w:pStyle w:val="Heading3"/>
@@ -2215,8 +2252,8 @@
         <w:t xml:space="preserve">) so it looks like a real device to management tools.</w:t>
       </w:r>
     </w:p>
-    <w:bookmarkEnd w:id="16"/>
-    <w:bookmarkStart w:id="17" w:name="X659cf57de27cf32016ac831a2ec0d1b7a212399"/>
+    <w:bookmarkEnd w:id="17"/>
+    <w:bookmarkStart w:id="18" w:name="X659cf57de27cf32016ac831a2ec0d1b7a212399"/>
     <w:p>
       <w:pPr>
         <w:pStyle w:val="Heading3"/>
@@ -2280,9 +2317,9 @@
         </w:pict>
       </w:r>
     </w:p>
-    <w:bookmarkEnd w:id="17"/>
     <w:bookmarkEnd w:id="18"/>
-    <w:bookmarkStart w:id="19" w:name="Xb8703d693607fc79c1e0f86c31cfc0be8154f6c"/>
+    <w:bookmarkEnd w:id="19"/>
+    <w:bookmarkStart w:id="20" w:name="Xb8703d693607fc79c1e0f86c31cfc0be8154f6c"/>
     <w:p>
       <w:pPr>
         <w:pStyle w:val="Heading2"/>
@@ -2607,8 +2644,8 @@
         </w:pict>
       </w:r>
     </w:p>
-    <w:bookmarkEnd w:id="19"/>
-    <w:bookmarkStart w:id="20" w:name="Xb128b11b6fe46f1bb50a9f2dd33145871bd0b07"/>
+    <w:bookmarkEnd w:id="20"/>
+    <w:bookmarkStart w:id="21" w:name="Xb128b11b6fe46f1bb50a9f2dd33145871bd0b07"/>
     <w:p>
       <w:pPr>
         <w:pStyle w:val="Heading2"/>
@@ -3155,8 +3192,8 @@
         </w:pict>
       </w:r>
     </w:p>
-    <w:bookmarkEnd w:id="20"/>
-    <w:bookmarkStart w:id="26" w:name="Xa3218375c0a5dbb5a80df2743fedcc483a554e2"/>
+    <w:bookmarkEnd w:id="21"/>
+    <w:bookmarkStart w:id="27" w:name="Xa3218375c0a5dbb5a80df2743fedcc483a554e2"/>
     <w:p>
       <w:pPr>
         <w:pStyle w:val="Heading2"/>
@@ -3315,7 +3352,7 @@
         <w:t xml:space="preserve">Those details are stamped into a record saved next to every capture.</w:t>
       </w:r>
     </w:p>
-    <w:bookmarkStart w:id="21" w:name="X2e711e212bd51b787079622869e49da1edb1188"/>
+    <w:bookmarkStart w:id="22" w:name="X2e711e212bd51b787079622869e49da1edb1188"/>
     <w:p>
       <w:pPr>
         <w:pStyle w:val="Heading3"/>
@@ -3474,8 +3511,8 @@
         <w:t xml:space="preserve">— printcap just listens. It does not change the network.</w:t>
       </w:r>
     </w:p>
-    <w:bookmarkEnd w:id="21"/>
-    <w:bookmarkStart w:id="22" w:name="X32fb56f70b768633e3efdcacce193eeb06dd91c"/>
+    <w:bookmarkEnd w:id="22"/>
+    <w:bookmarkStart w:id="23" w:name="X32fb56f70b768633e3efdcacce193eeb06dd91c"/>
     <w:p>
       <w:pPr>
         <w:pStyle w:val="Heading3"/>
@@ -3560,8 +3597,8 @@
         <w:t xml:space="preserve">in-scope target.</w:t>
       </w:r>
     </w:p>
-    <w:bookmarkEnd w:id="22"/>
-    <w:bookmarkStart w:id="23" w:name="X7fca486d3c8e136ee4247f1ce90783d566c9f15"/>
+    <w:bookmarkEnd w:id="23"/>
+    <w:bookmarkStart w:id="24" w:name="X7fca486d3c8e136ee4247f1ce90783d566c9f15"/>
     <w:p>
       <w:pPr>
         <w:pStyle w:val="Heading3"/>
@@ -3786,8 +3823,8 @@
         <w:t xml:space="preserve">instead. Leave the ICS boxes blank to skip auto-NAT.</w:t>
       </w:r>
     </w:p>
-    <w:bookmarkEnd w:id="23"/>
-    <w:bookmarkStart w:id="24" w:name="X8f20b7073426448ce12416e7b40a26f13f6b35c"/>
+    <w:bookmarkEnd w:id="24"/>
+    <w:bookmarkStart w:id="25" w:name="X8f20b7073426448ce12416e7b40a26f13f6b35c"/>
     <w:p>
       <w:pPr>
         <w:pStyle w:val="Heading3"/>
@@ -3832,8 +3869,8 @@
         <w:t xml:space="preserve">Sharing is switched off. The Capture Window confirms this in its status line.</w:t>
       </w:r>
     </w:p>
-    <w:bookmarkEnd w:id="24"/>
-    <w:bookmarkStart w:id="25" w:name="Xece4cf780f62370064e585fd9a7c0a89e1bea6f"/>
+    <w:bookmarkEnd w:id="25"/>
+    <w:bookmarkStart w:id="26" w:name="Xece4cf780f62370064e585fd9a7c0a89e1bea6f"/>
     <w:p>
       <w:pPr>
         <w:pStyle w:val="Heading3"/>
@@ -3961,9 +3998,9 @@
         </w:pict>
       </w:r>
     </w:p>
-    <w:bookmarkEnd w:id="25"/>
     <w:bookmarkEnd w:id="26"/>
-    <w:bookmarkStart w:id="32" w:name="Xe79b19acbb73eab6b6bb3b5a60070afc524262a"/>
+    <w:bookmarkEnd w:id="27"/>
+    <w:bookmarkStart w:id="33" w:name="Xe79b19acbb73eab6b6bb3b5a60070afc524262a"/>
     <w:p>
       <w:pPr>
         <w:pStyle w:val="Heading2"/>
@@ -4012,7 +4049,7 @@
         <w:t xml:space="preserve">section.</w:t>
       </w:r>
     </w:p>
-    <w:bookmarkStart w:id="27" w:name="X67f3cddcb870b15a713b11c35033720b97c5767"/>
+    <w:bookmarkStart w:id="28" w:name="X67f3cddcb870b15a713b11c35033720b97c5767"/>
     <w:p>
       <w:pPr>
         <w:pStyle w:val="Heading3"/>
@@ -4086,8 +4123,8 @@
         <w:t xml:space="preserve">from disk, with paging.</w:t>
       </w:r>
     </w:p>
-    <w:bookmarkEnd w:id="27"/>
-    <w:bookmarkStart w:id="28" w:name="Xfe3f3f74468517a01c4a0efc3f1bee81833a6fb"/>
+    <w:bookmarkEnd w:id="28"/>
+    <w:bookmarkStart w:id="29" w:name="Xfe3f3f74468517a01c4a0efc3f1bee81833a6fb"/>
     <w:p>
       <w:pPr>
         <w:pStyle w:val="Heading3"/>
@@ -4315,8 +4352,8 @@
         </w:tc>
       </w:tr>
     </w:tbl>
-    <w:bookmarkEnd w:id="28"/>
-    <w:bookmarkStart w:id="29" w:name="Xb66b42e4cb8f3efffa2e79ad793725e325666d4"/>
+    <w:bookmarkEnd w:id="29"/>
+    <w:bookmarkStart w:id="30" w:name="Xb66b42e4cb8f3efffa2e79ad793725e325666d4"/>
     <w:p>
       <w:pPr>
         <w:pStyle w:val="Heading3"/>
@@ -4391,8 +4428,8 @@
         <w:t xml:space="preserve">— encrypted HTTPS (port 443).</w:t>
       </w:r>
     </w:p>
-    <w:bookmarkEnd w:id="29"/>
-    <w:bookmarkStart w:id="30" w:name="Xc2e3effc9e10cb755e6e5c17cae7ab44ba1bb72"/>
+    <w:bookmarkEnd w:id="30"/>
+    <w:bookmarkStart w:id="31" w:name="Xc2e3effc9e10cb755e6e5c17cae7ab44ba1bb72"/>
     <w:p>
       <w:pPr>
         <w:pStyle w:val="Heading3"/>
@@ -4479,8 +4516,8 @@
         <w:t xml:space="preserve">— other low-level frames; the Info column shows the EtherType.</w:t>
       </w:r>
     </w:p>
-    <w:bookmarkEnd w:id="30"/>
-    <w:bookmarkStart w:id="31" w:name="X5fa07e6c7cddc2b55000105ef0049a3873cce80"/>
+    <w:bookmarkEnd w:id="31"/>
+    <w:bookmarkStart w:id="32" w:name="X5fa07e6c7cddc2b55000105ef0049a3873cce80"/>
     <w:p>
       <w:pPr>
         <w:pStyle w:val="Heading3"/>
@@ -4563,9 +4600,9 @@
         </w:pict>
       </w:r>
     </w:p>
-    <w:bookmarkEnd w:id="31"/>
     <w:bookmarkEnd w:id="32"/>
-    <w:bookmarkStart w:id="37" w:name="X17d1ec6f8940800e636404eec933a3068e8f085"/>
+    <w:bookmarkEnd w:id="33"/>
+    <w:bookmarkStart w:id="38" w:name="X17d1ec6f8940800e636404eec933a3068e8f085"/>
     <w:p>
       <w:pPr>
         <w:pStyle w:val="Heading2"/>
@@ -4617,7 +4654,7 @@
         <w:t xml:space="preserve">anywhere in the row.</w:t>
       </w:r>
     </w:p>
-    <w:bookmarkStart w:id="33" w:name="Xd277c02fd0f7693af47ba5825be675308bb7016"/>
+    <w:bookmarkStart w:id="34" w:name="Xd277c02fd0f7693af47ba5825be675308bb7016"/>
     <w:p>
       <w:pPr>
         <w:pStyle w:val="Heading3"/>
@@ -5062,8 +5099,8 @@
         </w:tc>
       </w:tr>
     </w:tbl>
-    <w:bookmarkEnd w:id="33"/>
-    <w:bookmarkStart w:id="34" w:name="Xea218ecd473cbfcb4d7cced9658ccf3e970e453"/>
+    <w:bookmarkEnd w:id="34"/>
+    <w:bookmarkStart w:id="35" w:name="Xea218ecd473cbfcb4d7cced9658ccf3e970e453"/>
     <w:p>
       <w:pPr>
         <w:pStyle w:val="Heading3"/>
@@ -5299,8 +5336,8 @@
         </w:tc>
       </w:tr>
     </w:tbl>
-    <w:bookmarkEnd w:id="34"/>
-    <w:bookmarkStart w:id="35" w:name="X242b52dd0dc1c53b487607bf4d365e127d2a5a7"/>
+    <w:bookmarkEnd w:id="35"/>
+    <w:bookmarkStart w:id="36" w:name="X242b52dd0dc1c53b487607bf4d365e127d2a5a7"/>
     <w:p>
       <w:pPr>
         <w:pStyle w:val="Heading3"/>
@@ -5437,8 +5474,8 @@
         <w:t xml:space="preserve">checkbox — limits the view to the printer IP you set.</w:t>
       </w:r>
     </w:p>
-    <w:bookmarkEnd w:id="35"/>
-    <w:bookmarkStart w:id="36" w:name="Xfe7cd4e8a0c5760873a78f030ce18df287f0d7f"/>
+    <w:bookmarkEnd w:id="36"/>
+    <w:bookmarkStart w:id="37" w:name="Xfe7cd4e8a0c5760873a78f030ce18df287f0d7f"/>
     <w:p>
       <w:pPr>
         <w:pStyle w:val="Heading3"/>
@@ -5544,9 +5581,9 @@
         </w:pict>
       </w:r>
     </w:p>
-    <w:bookmarkEnd w:id="36"/>
     <w:bookmarkEnd w:id="37"/>
-    <w:bookmarkStart w:id="38" w:name="Xe111ae8fc5c3db93585679ae18090e7d2ea523c"/>
+    <w:bookmarkEnd w:id="38"/>
+    <w:bookmarkStart w:id="39" w:name="Xe111ae8fc5c3db93585679ae18090e7d2ea523c"/>
     <w:p>
       <w:pPr>
         <w:pStyle w:val="Heading2"/>
@@ -5757,8 +5794,8 @@
         </w:pict>
       </w:r>
     </w:p>
-    <w:bookmarkEnd w:id="38"/>
-    <w:bookmarkStart w:id="39" w:name="X2ec5fe144cf8323a7bdea4ff0e35854a32776d4"/>
+    <w:bookmarkEnd w:id="39"/>
+    <w:bookmarkStart w:id="40" w:name="X2ec5fe144cf8323a7bdea4ff0e35854a32776d4"/>
     <w:p>
       <w:pPr>
         <w:pStyle w:val="Heading2"/>
@@ -6016,8 +6053,8 @@
         </w:pict>
       </w:r>
     </w:p>
-    <w:bookmarkEnd w:id="39"/>
-    <w:bookmarkStart w:id="40" w:name="Xf081ebb1e2e24c6066ca5366b5b2e170e58d45d"/>
+    <w:bookmarkEnd w:id="40"/>
+    <w:bookmarkStart w:id="41" w:name="Xf081ebb1e2e24c6066ca5366b5b2e170e58d45d"/>
     <w:p>
       <w:pPr>
         <w:pStyle w:val="Heading2"/>
@@ -6172,8 +6209,8 @@
         </w:pict>
       </w:r>
     </w:p>
-    <w:bookmarkEnd w:id="40"/>
-    <w:bookmarkStart w:id="49" w:name="Xfc180d67246a5ce2684643e0401fa066796bdbe"/>
+    <w:bookmarkEnd w:id="41"/>
+    <w:bookmarkStart w:id="50" w:name="Xfc180d67246a5ce2684643e0401fa066796bdbe"/>
     <w:p>
       <w:pPr>
         <w:pStyle w:val="Heading2"/>
@@ -6182,7 +6219,7 @@
         <w:t xml:space="preserve">14. Troubleshooting &amp; FAQ</w:t>
       </w:r>
     </w:p>
-    <w:bookmarkStart w:id="41" w:name="npcap--pcap-not-installed"/>
+    <w:bookmarkStart w:id="42" w:name="npcap--pcap-not-installed"/>
     <w:p>
       <w:pPr>
         <w:pStyle w:val="Heading3"/>
@@ -6338,8 +6375,8 @@
         <w:t xml:space="preserve">need Npcap.)</w:t>
       </w:r>
     </w:p>
-    <w:bookmarkEnd w:id="41"/>
-    <w:bookmarkStart w:id="42" w:name="port-already-in-use--a-listener-failed"/>
+    <w:bookmarkEnd w:id="42"/>
+    <w:bookmarkStart w:id="43" w:name="port-already-in-use--a-listener-failed"/>
     <w:p>
       <w:pPr>
         <w:pStyle w:val="Heading3"/>
@@ -6384,8 +6421,8 @@
         <w:t xml:space="preserve">protocol, or stop the conflicting program.</w:t>
       </w:r>
     </w:p>
-    <w:bookmarkEnd w:id="42"/>
-    <w:bookmarkStart w:id="43" w:name="nothing-gets-captured-when-i-print"/>
+    <w:bookmarkEnd w:id="43"/>
+    <w:bookmarkStart w:id="44" w:name="nothing-gets-captured-when-i-print"/>
     <w:p>
       <w:pPr>
         <w:pStyle w:val="Heading3"/>
@@ -6547,8 +6584,8 @@
         <w:t xml:space="preserve">515/631)?</w:t>
       </w:r>
     </w:p>
-    <w:bookmarkEnd w:id="43"/>
-    <w:bookmarkStart w:id="44" w:name="i-see-ipv6-packets-i-dont-want"/>
+    <w:bookmarkEnd w:id="44"/>
+    <w:bookmarkStart w:id="45" w:name="i-see-ipv6-packets-i-dont-want"/>
     <w:p>
       <w:pPr>
         <w:pStyle w:val="Heading3"/>
@@ -6631,8 +6668,8 @@
         <w:t xml:space="preserve">capture (it takes effect on the next start).</w:t>
       </w:r>
     </w:p>
-    <w:bookmarkEnd w:id="44"/>
-    <w:bookmarkStart w:id="45" w:name="ring-overrun--older-packets-dropped"/>
+    <w:bookmarkEnd w:id="45"/>
+    <w:bookmarkStart w:id="46" w:name="ring-overrun--older-packets-dropped"/>
     <w:p>
       <w:pPr>
         <w:pStyle w:val="Heading3"/>
@@ -6708,8 +6745,8 @@
         <w:t xml:space="preserve">or in Wireshark to see everything.</w:t>
       </w:r>
     </w:p>
-    <w:bookmarkEnd w:id="45"/>
-    <w:bookmarkStart w:id="46" w:name="X7df55d64d3b5544047d7152a8a1da9af6ba2516"/>
+    <w:bookmarkEnd w:id="46"/>
+    <w:bookmarkStart w:id="47" w:name="X7df55d64d3b5544047d7152a8a1da9af6ba2516"/>
     <w:p>
       <w:pPr>
         <w:pStyle w:val="Heading3"/>
@@ -6751,8 +6788,8 @@
         <w:t xml:space="preserve">, or double-click to follow the stream.</w:t>
       </w:r>
     </w:p>
-    <w:bookmarkEnd w:id="46"/>
-    <w:bookmarkStart w:id="47" w:name="what-are-all-the-arp--non-ip-rows"/>
+    <w:bookmarkEnd w:id="47"/>
+    <w:bookmarkStart w:id="48" w:name="what-are-all-the-arp--non-ip-rows"/>
     <w:p>
       <w:pPr>
         <w:pStyle w:val="Heading3"/>
@@ -6781,8 +6818,8 @@
         <w:t xml:space="preserve">column shows what kind.</w:t>
       </w:r>
     </w:p>
-    <w:bookmarkEnd w:id="47"/>
-    <w:bookmarkStart w:id="48" w:name="my-settings-didnt-save"/>
+    <w:bookmarkEnd w:id="48"/>
+    <w:bookmarkStart w:id="49" w:name="my-settings-didnt-save"/>
     <w:p>
       <w:pPr>
         <w:pStyle w:val="Heading3"/>
@@ -6866,9 +6903,9 @@
         </w:pict>
       </w:r>
     </w:p>
-    <w:bookmarkEnd w:id="48"/>
     <w:bookmarkEnd w:id="49"/>
-    <w:bookmarkStart w:id="50" w:name="Xdce06a4ec52ad5d8ecc4233264fbfd4b968d612"/>
+    <w:bookmarkEnd w:id="50"/>
+    <w:bookmarkStart w:id="51" w:name="Xdce06a4ec52ad5d8ecc4233264fbfd4b968d612"/>
     <w:p>
       <w:pPr>
         <w:pStyle w:val="Heading2"/>
@@ -7462,8 +7499,8 @@
         <w:t xml:space="preserve">permission to capture on a network, stop and ask.</w:t>
       </w:r>
     </w:p>
-    <w:bookmarkEnd w:id="50"/>
     <w:bookmarkEnd w:id="51"/>
+    <w:bookmarkEnd w:id="52"/>
     <w:sectPr>
       <w:footnotePr>
         <w:numRestart w:val="eachSect"/>

</xml_diff>